<commit_message>
open_items: add item 4 (step05 argument correction) and item 5 (step06 residue list)
</commit_message>
<xml_diff>
--- a/04_substrate_placement/writeup/methods_X1_4.docx
+++ b/04_substrate_placement/writeup/methods_X1_4.docx
@@ -1666,6 +1666,155 @@
         </w:tc>
       </w:tr>
     </w:tbl>
+    <w:p>
+      <w:pPr>
+        <w:pStyle w:val="BodyText"/>
+      </w:pPr>
+      <w:r>
+        <w:t xml:space="preserve">Arg63′ lay at 6.380 Å at site C against 2.899 and 3.060 Å at sites A and B. I established</w:t>
+      </w:r>
+      <w:r>
+        <w:t xml:space="preserve"> </w:t>
+      </w:r>
+      <w:r>
+        <w:t xml:space="preserve">that this asymmetry is inherited from the crystal rather than introduced by the repair or</w:t>
+      </w:r>
+      <w:r>
+        <w:t xml:space="preserve"> </w:t>
+      </w:r>
+      <w:r>
+        <w:t xml:space="preserve">the placement, using</w:t>
+      </w:r>
+      <w:r>
+        <w:t xml:space="preserve"> </w:t>
+      </w:r>
+      <w:r>
+        <w:rPr>
+          <w:rStyle w:val="VerbatimChar"/>
+        </w:rPr>
+        <w:t xml:space="preserve">step05_arg63_provenance.sh</w:t>
+      </w:r>
+      <w:r>
+        <w:t xml:space="preserve"> </w:t>
+      </w:r>
+      <w:r>
+        <w:t xml:space="preserve">and</w:t>
+      </w:r>
+      <w:r>
+        <w:t xml:space="preserve"> </w:t>
+      </w:r>
+      <w:r>
+        <w:rPr>
+          <w:rStyle w:val="VerbatimChar"/>
+        </w:rPr>
+        <w:t xml:space="preserve">step05b_arg63_conformation_check.sh</w:t>
+      </w:r>
+      <w:r>
+        <w:t xml:space="preserve">.</w:t>
+      </w:r>
+      <w:r>
+        <w:t xml:space="preserve"> </w:t>
+      </w:r>
+      <w:r>
+        <w:t xml:space="preserve">Placement transforms the substrate into the target site and leaves the protein untouched,</w:t>
+      </w:r>
+      <w:r>
+        <w:t xml:space="preserve"> </w:t>
+      </w:r>
+      <w:r>
+        <w:t xml:space="preserve">so the Arg63′ conformation a placed substrate encounters is the one belonging to its target</w:t>
+      </w:r>
+      <w:r>
+        <w:t xml:space="preserve"> </w:t>
+      </w:r>
+      <w:r>
+        <w:t xml:space="preserve">analogue site. Surveying all twelve analogue sites in the raw deposition gave nearest</w:t>
+      </w:r>
+      <w:r>
+        <w:t xml:space="preserve"> </w:t>
+      </w:r>
+      <w:r>
+        <w:t xml:space="preserve">guanidinium-nitrogen distances of 2.900 Å at A203, 2.876 Å at B201 and 8.385 Å at C202, a</w:t>
+      </w:r>
+      <w:r>
+        <w:t xml:space="preserve"> </w:t>
+      </w:r>
+      <w:r>
+        <w:t xml:space="preserve">pattern the placed complex reproduces to within 0.184 Å. Across the full deposition, seven</w:t>
+      </w:r>
+      <w:r>
+        <w:t xml:space="preserve"> </w:t>
+      </w:r>
+      <w:r>
+        <w:t xml:space="preserve">of the twelve sites carried the guanidinium swung away beyond 4.5 Å and five were bound.</w:t>
+      </w:r>
+      <w:r>
+        <w:t xml:space="preserve"> </w:t>
+      </w:r>
+      <w:r>
+        <w:t xml:space="preserve">Comparing the repaired Arg63 side chains directly against the raw deposition gave a</w:t>
+      </w:r>
+      <w:r>
+        <w:t xml:space="preserve"> </w:t>
+      </w:r>
+      <w:r>
+        <w:t xml:space="preserve">side-chain RMSD of 0.000 Å over seven atoms in each of the three chains, so the repair</w:t>
+      </w:r>
+      <w:r>
+        <w:t xml:space="preserve"> </w:t>
+      </w:r>
+      <w:r>
+        <w:t xml:space="preserve">altered no Arg63 side chain.</w:t>
+      </w:r>
+    </w:p>
+    <w:p>
+      <w:pPr>
+        <w:pStyle w:val="BodyText"/>
+      </w:pPr>
+      <w:r>
+        <w:t xml:space="preserve">Claeyssens</w:t>
+      </w:r>
+      <w:r>
+        <w:t xml:space="preserve"> </w:t>
+      </w:r>
+      <w:r>
+        <w:rPr>
+          <w:iCs/>
+          <w:i/>
+        </w:rPr>
+        <w:t xml:space="preserve">et al.</w:t>
+      </w:r>
+      <w:r>
+        <w:t xml:space="preserve"> </w:t>
+      </w:r>
+      <w:r>
+        <w:t xml:space="preserve">(2011) report the same heterogeneity in the crystallographic record,</w:t>
+      </w:r>
+      <w:r>
+        <w:t xml:space="preserve"> </w:t>
+      </w:r>
+      <w:r>
+        <w:t xml:space="preserve">finding Arg63 bound to the substrate in roughly one third of active sites and solvent</w:t>
+      </w:r>
+      <w:r>
+        <w:t xml:space="preserve"> </w:t>
+      </w:r>
+      <w:r>
+        <w:t xml:space="preserve">exposed in the remainder, and cite calculations showing little difference in barrier height</w:t>
+      </w:r>
+      <w:r>
+        <w:t xml:space="preserve"> </w:t>
+      </w:r>
+      <w:r>
+        <w:t xml:space="preserve">between the bound and unbound arrangements. Their own decomposition assigns Arg63 a</w:t>
+      </w:r>
+      <w:r>
+        <w:t xml:space="preserve"> </w:t>
+      </w:r>
+      <w:r>
+        <w:t xml:space="preserve">destabilising average contribution of −0.6 ± 0.5 kcal mol⁻¹.</w:t>
+      </w:r>
+    </w:p>
     <w:p>
       <w:pPr>
         <w:pStyle w:val="BodyText"/>

</xml_diff>